<commit_message>
docs: regenerate Momento 6 HTML, PDF and DOCX with the 19-year figures
Los derivados eran del 2 y 9 de septiembre y seguian mostrando las cifras de 18
años tras actualizar el .md en 605274a.

generate_momento6_pdf.py lleva el HTML embebido como string, de modo que no
hereda los cambios del markdown: se actualizan ahi las mismas cifras (Top 43 ->
Top 45, AUC 0.8308 -> 0.8295, Recall 76.49% -> 76.44%, tau 0.35 -> 0.45,
18 -> 19 años, 285k -> 304k niños, 2007-2024 -> 2007-2025).

El script define pdf_path pero nunca lo usa: solo escribe el HTML. El PDF se
genera con Chrome headless (--print-to-pdf) y el DOCX con pandoc desde el
markdown ya actualizado.

Verificado que los tres archivos contienen las cifras vigentes y ninguna de las
anteriores.

Co-Authored-By: Claude Opus 5 <noreply@anthropic.com>
</commit_message>
<xml_diff>
--- a/expo/semestre2/sesion2/Momento6_Plan_Validacion_Resultados.docx
+++ b/expo/semestre2/sesion2/Momento6_Plan_Validacion_Resultados.docx
@@ -87,7 +87,7 @@
           <w:i/>
           <w:iCs/>
         </w:rPr>
-        <w:t xml:space="preserve">Sistema Predictivo de Riesgo de Desnutrición Crónica Infantil en el Perú mediante Machine Learning (ENDES 2007–2024)</w:t>
+        <w:t xml:space="preserve">Sistema Predictivo de Riesgo de Desnutrición Crónica Infantil en el Perú mediante Machine Learning (ENDES 2007–2025)</w:t>
       </w:r>
       <w:r>
         <w:br/>
@@ -147,7 +147,7 @@
           <w:i/>
           <w:iCs/>
         </w:rPr>
-        <w:t xml:space="preserve">LightGBM con 43 variables</w:t>
+        <w:t xml:space="preserve">LightGBM con 45 variables</w:t>
       </w:r>
       <w:r>
         <w:t xml:space="preserve">), estructurado en</w:t>
@@ -492,7 +492,7 @@
           <w:b/>
           <w:bCs/>
         </w:rPr>
-        <w:t xml:space="preserve">Línea Base (Completada en ciclo anterior):</w:t>
+        <w:t xml:space="preserve">Línea Base (Actualizada — ENDES 2007–2025):</w:t>
       </w:r>
       <w:r>
         <w:t xml:space="preserve"> </w:t>
@@ -523,7 +523,23 @@
         <w:t xml:space="preserve">HV005</w:t>
       </w:r>
       <w:r>
-        <w:t xml:space="preserve">), obteniendo AUC de 0.8308 y Recall de 76.49% con semilla fija (</w:t>
+        <w:t xml:space="preserve">), obteniendo</w:t>
+      </w:r>
+      <w:r>
+        <w:t xml:space="preserve"> </w:t>
+      </w:r>
+      <w:r>
+        <w:rPr>
+          <w:b/>
+          <w:bCs/>
+        </w:rPr>
+        <w:t xml:space="preserve">AUC de 0.8295 y Recall de 76.44%</w:t>
+      </w:r>
+      <w:r>
+        <w:t xml:space="preserve"> </w:t>
+      </w:r>
+      <w:r>
+        <w:t xml:space="preserve">con semilla fija (</w:t>
       </w:r>
       <w:r>
         <w:rPr>
@@ -532,7 +548,88 @@
         <w:t xml:space="preserve">random_state = 42</w:t>
       </w:r>
       <w:r>
-        <w:t xml:space="preserve">).</w:t>
+        <w:t xml:space="preserve">) sobre</w:t>
+      </w:r>
+      <w:r>
+        <w:t xml:space="preserve"> </w:t>
+      </w:r>
+      <w:r>
+        <w:rPr>
+          <w:b/>
+          <w:bCs/>
+        </w:rPr>
+        <w:t xml:space="preserve">304,271 niños</w:t>
+      </w:r>
+      <w:r>
+        <w:t xml:space="preserve">.</w:t>
+      </w:r>
+      <w:r>
+        <w:t xml:space="preserve"> </w:t>
+      </w:r>
+      <w:r>
+        <w:t xml:space="preserve">&gt;</w:t>
+      </w:r>
+      <w:r>
+        <w:t xml:space="preserve"> </w:t>
+      </w:r>
+      <w:r>
+        <w:rPr>
+          <w:b/>
+          <w:bCs/>
+        </w:rPr>
+        <w:t xml:space="preserve">Nota de avance (14/09/2026):</w:t>
+      </w:r>
+      <w:r>
+        <w:t xml:space="preserve"> </w:t>
+      </w:r>
+      <w:r>
+        <w:t xml:space="preserve">la línea base se recalculó al incorporar la ENDES 2025, que el INEI publicó durante la ejecución del plan. El horizonte pasa de 18 a 19 años y la muestra de 285,284 a 304,271 niños. LightGBM se mantiene como campeón y el orden del</w:t>
+      </w:r>
+      <w:r>
+        <w:t xml:space="preserve"> </w:t>
+      </w:r>
+      <w:r>
+        <w:rPr>
+          <w:i/>
+          <w:iCs/>
+        </w:rPr>
+        <w:t xml:space="preserve">benchmarking</w:t>
+      </w:r>
+      <w:r>
+        <w:t xml:space="preserve"> </w:t>
+      </w:r>
+      <w:r>
+        <w:t xml:space="preserve">no varía; el desplazamiento del AUC (−0.0013) queda dentro de la dispersión entre pliegues (0.8230–0.8353), lo que evidencia estabilidad del modelo. El subconjunto pasa de 43 a 45 variables:</w:t>
+      </w:r>
+      <w:r>
+        <w:t xml:space="preserve"> </w:t>
+      </w:r>
+      <w:r>
+        <w:rPr>
+          <w:rStyle w:val="VerbatimChar"/>
+        </w:rPr>
+        <w:t xml:space="preserve">HV219</w:t>
+      </w:r>
+      <w:r>
+        <w:t xml:space="preserve"> </w:t>
+      </w:r>
+      <w:r>
+        <w:t xml:space="preserve">y</w:t>
+      </w:r>
+      <w:r>
+        <w:t xml:space="preserve"> </w:t>
+      </w:r>
+      <w:r>
+        <w:rPr>
+          <w:rStyle w:val="VerbatimChar"/>
+        </w:rPr>
+        <w:t xml:space="preserve">SH77F</w:t>
+      </w:r>
+      <w:r>
+        <w:t xml:space="preserve"> </w:t>
+      </w:r>
+      <w:r>
+        <w:t xml:space="preserve">cruzan el umbral de importancia con el año adicional, sin que ninguna de las 43 originales sea descartada.</w:t>
       </w:r>
     </w:p>
     <w:p>
@@ -973,14 +1070,14 @@
                 <m:rPr>
                   <m:sty m:val="p"/>
                 </m:rPr>
-                <m:t>≈</m:t>
-              </m:r>
-              <m:r>
-                <m:t>0.35</m:t>
+                <m:t>=</m:t>
+              </m:r>
+              <m:r>
+                <m:t>0.45</m:t>
               </m:r>
             </m:oMath>
             <w:r>
-              <w:t xml:space="preserve">).</w:t>
+              <w:t xml:space="preserve">; cobertura 80.46%, precisión 34.04%).</w:t>
             </w:r>
           </w:p>
         </w:tc>
@@ -1639,7 +1736,7 @@
         <w:t xml:space="preserve"> </w:t>
       </w:r>
       <w:r>
-        <w:t xml:space="preserve">Manejo adecuado de 18 años de datos ENDES y tratamiento de nulos.</w:t>
+        <w:t xml:space="preserve">Manejo adecuado de 19 años de datos ENDES y tratamiento de nulos.</w:t>
       </w:r>
     </w:p>
     <w:p>
@@ -2192,7 +2289,7 @@
               <w:pStyle w:val="Compact"/>
             </w:pPr>
             <w:r>
-              <w:t xml:space="preserve">Selección de 43 variables exclusivamente de encuesta.</w:t>
+              <w:t xml:space="preserve">Selección de 45 variables exclusivamente de encuesta.</w:t>
             </w:r>
           </w:p>
         </w:tc>
@@ -3205,7 +3302,7 @@
               <w:pStyle w:val="Compact"/>
             </w:pPr>
             <w:r>
-              <w:t xml:space="preserve">Los 3 ejes responden de forma directa a la estructura tabular de la ENDES (285k registros, 18 años) y al enfoque de triaje preventivo de salud pública desde la Ingeniería de Sistemas.</w:t>
+              <w:t xml:space="preserve">Los 3 ejes responden de forma directa a la estructura tabular de la ENDES (304k registros, 19 años) y al enfoque de triaje preventivo de salud pública desde la Ingeniería de Sistemas.</w:t>
             </w:r>
           </w:p>
         </w:tc>

</xml_diff>